<commit_message>
Cover letter: request a full APC waiver on grounds of no funding
Desalination and Water Treatment has been fully open access since 1 January 2024 with an
article publishing charge of up to USD 1,400 and no subscription route, and the United
States is not covered by the Research4Life waiver, so the only route is Elsevier's
discretionary waiver for genuine need. The letter now raises it, while noting that the
decision is made after acceptance at the rights and access stage.

Co-Authored-By: Claude Opus 5 <noreply@anthropic.com>
</commit_message>
<xml_diff>
--- a/revision2/DWT_Revision2_Cover_Letter.docx
+++ b/revision2/DWT_Revision2_Cover_Letter.docx
@@ -314,6 +314,22 @@
       </w:pPr>
       <w:r>
         <w:t>the plotting script for the two new figures, for deposit alongside the model code.</w:t>
+      </w:r>
+    </w:p>
+    <w:p>
+      <w:r>
+        <w:rPr>
+          <w:b/>
+          <w:i w:val="0"/>
+        </w:rPr>
+        <w:t xml:space="preserve">Request for an article publishing charge waiver. </w:t>
+      </w:r>
+      <w:r>
+        <w:rPr>
+          <w:b w:val="0"/>
+          <w:i w:val="0"/>
+        </w:rPr>
+        <w:t>I am an independent researcher with no institutional affiliation, no grant and no other source of funds for publication charges, and I am not able to pay the article publishing charge. I would be grateful if a full waiver could be considered under Elsevier's policy of granting waivers in cases of genuine need. This work received no funding of any kind, as the Funding declaration in the manuscript records, and the computation reported in it was carried out on personal equipment; the model code and the manuscript are already openly deposited at the DOIs given in the Data availability statement, so the work is freely available irrespective of the outcome of this request. I understand that the decision is made after acceptance, at the rights and access stage, and I raise it here only so that it does not arise late. I will complete any form or provide any statement the journal requires.</w:t>
       </w:r>
     </w:p>
     <w:p>

</xml_diff>